<commit_message>
Arquivo de Extensão - Retificado
</commit_message>
<xml_diff>
--- a/documentos/Documento - Projeto de Extensão - COM Empresa.docx
+++ b/documentos/Documento - Projeto de Extensão - COM Empresa.docx
@@ -559,44 +559,38 @@
           <w:p>
             <w:pPr>
               <w:rPr>
+                <w:rFonts w:ascii="Arial" w:hAnsi="Arial" w:cs="Arial"/>
                 <w:b/>
                 <w:color w:val="000000"/>
-              </w:rPr>
-            </w:pPr>
-            <w:r>
-              <w:t>Kátia Milani Lara Bossi</w:t>
-            </w:r>
-            <w:r>
-              <w:t xml:space="preserve">, </w:t>
-            </w:r>
-            <w:r>
-              <w:t>Cristina Machado Correa Leite</w:t>
-            </w:r>
-            <w:r>
-              <w:t xml:space="preserve">, </w:t>
-            </w:r>
-            <w:r>
-              <w:t>Francisco de Souza Escobar</w:t>
-            </w:r>
-            <w:r>
-              <w:t xml:space="preserve">, </w:t>
-            </w:r>
-            <w:r>
-              <w:t>David de Oliveira Lemes</w:t>
-            </w:r>
-            <w:r>
-              <w:t xml:space="preserve">, </w:t>
+                <w:sz w:val="24"/>
+                <w:szCs w:val="24"/>
+              </w:rPr>
+            </w:pPr>
+            <w:r>
+              <w:rPr>
+                <w:rFonts w:ascii="Arial" w:hAnsi="Arial" w:cs="Arial"/>
+                <w:sz w:val="24"/>
+                <w:szCs w:val="24"/>
+              </w:rPr>
+              <w:t xml:space="preserve">Kátia Milani Lara Bossi, Cristina Machado Correa Leite, Francisco de Souza Escobar, David de Oliveira Lemes, </w:t>
             </w:r>
             <w:proofErr w:type="spellStart"/>
             <w:r>
+              <w:rPr>
+                <w:rFonts w:ascii="Arial" w:hAnsi="Arial" w:cs="Arial"/>
+                <w:sz w:val="24"/>
+                <w:szCs w:val="24"/>
+              </w:rPr>
               <w:t>Jésus</w:t>
             </w:r>
             <w:proofErr w:type="spellEnd"/>
             <w:r>
-              <w:t xml:space="preserve"> Gomes</w:t>
-            </w:r>
-            <w:r>
-              <w:t>.</w:t>
+              <w:rPr>
+                <w:rFonts w:ascii="Arial" w:hAnsi="Arial" w:cs="Arial"/>
+                <w:sz w:val="24"/>
+                <w:szCs w:val="24"/>
+              </w:rPr>
+              <w:t xml:space="preserve"> Gomes.</w:t>
             </w:r>
           </w:p>
         </w:tc>
@@ -1090,10 +1084,18 @@
           <w:p>
             <w:pPr>
               <w:rPr>
+                <w:rFonts w:ascii="Arial" w:hAnsi="Arial" w:cs="Arial"/>
                 <w:b/>
-              </w:rPr>
-            </w:pPr>
-            <w:r>
+                <w:sz w:val="24"/>
+                <w:szCs w:val="24"/>
+              </w:rPr>
+            </w:pPr>
+            <w:r>
+              <w:rPr>
+                <w:rFonts w:ascii="Arial" w:hAnsi="Arial" w:cs="Arial"/>
+                <w:sz w:val="24"/>
+                <w:szCs w:val="24"/>
+              </w:rPr>
               <w:t>O tema que gerou o projeto foi a necessidade da criação de um sistema de administração das equipes do Projeto Lideranças Empáticas.</w:t>
             </w:r>
           </w:p>
@@ -1147,14 +1149,28 @@
           <w:p>
             <w:pPr>
               <w:rPr>
+                <w:rFonts w:ascii="Arial" w:hAnsi="Arial" w:cs="Arial"/>
                 <w:b/>
-              </w:rPr>
-            </w:pPr>
-            <w:r>
-              <w:t>O produto que está sendo desenvolvido tem a finalidade de auxiliar os gestores, mentores e as equipe do projeto Lideranças Empáticas</w:t>
-            </w:r>
-            <w:r>
-              <w:t xml:space="preserve">, para que melhore a comunicação e acompanhamento das equipes, assim alinhando melhor as consultas e progressos de cada equipe. </w:t>
+                <w:sz w:val="24"/>
+                <w:szCs w:val="24"/>
+              </w:rPr>
+            </w:pPr>
+            <w:r>
+              <w:rPr>
+                <w:rFonts w:ascii="Arial" w:hAnsi="Arial" w:cs="Arial"/>
+                <w:sz w:val="24"/>
+                <w:szCs w:val="24"/>
+              </w:rPr>
+              <w:t xml:space="preserve">O produto que está sendo desenvolvido tem a finalidade de auxiliar os gestores, mentores e as equipes do projeto Lideranças Empáticas, para que melhorem a </w:t>
+            </w:r>
+            <w:r>
+              <w:rPr>
+                <w:rFonts w:ascii="Arial" w:hAnsi="Arial" w:cs="Arial"/>
+                <w:sz w:val="24"/>
+                <w:szCs w:val="24"/>
+              </w:rPr>
+              <w:lastRenderedPageBreak/>
+              <w:t>comunicação e o acompanhamento das equipes, alinhando melhor as consultas e os progressos de cada uma.</w:t>
             </w:r>
           </w:p>
         </w:tc>
@@ -1283,11 +1299,19 @@
           <w:p>
             <w:pPr>
               <w:rPr>
+                <w:rFonts w:ascii="Arial" w:hAnsi="Arial" w:cs="Arial"/>
                 <w:color w:val="FF3333"/>
-              </w:rPr>
-            </w:pPr>
-            <w:r>
-              <w:t xml:space="preserve">O cenário de intervenção do projeto é diretamente para uso administrativo dos gestores e equipes do projeto Lideranças Empáticas, ajudando na visualização de progresso das equipes, parte financeira e comunicação gestor – equipe. </w:t>
+                <w:sz w:val="24"/>
+                <w:szCs w:val="24"/>
+              </w:rPr>
+            </w:pPr>
+            <w:r>
+              <w:rPr>
+                <w:rFonts w:ascii="Arial" w:hAnsi="Arial" w:cs="Arial"/>
+                <w:sz w:val="24"/>
+                <w:szCs w:val="24"/>
+              </w:rPr>
+              <w:t>O cenário de intervenção do projeto destina-se diretamente ao uso administrativo dos gestores e das equipes do projeto Lideranças Empáticas, auxiliando na visualização do progresso das equipes, na parte financeira e na comunicação entre gestor e equipe.</w:t>
             </w:r>
           </w:p>
         </w:tc>
@@ -1349,13 +1373,26 @@
           <w:p>
             <w:pPr>
               <w:rPr>
+                <w:rFonts w:ascii="Arial" w:hAnsi="Arial" w:cs="Arial"/>
                 <w:color w:val="1F4E79"/>
-              </w:rPr>
-            </w:pPr>
-            <w:r>
+                <w:sz w:val="24"/>
+                <w:szCs w:val="24"/>
+              </w:rPr>
+            </w:pPr>
+            <w:r>
+              <w:rPr>
+                <w:rFonts w:ascii="Arial" w:hAnsi="Arial" w:cs="Arial"/>
+                <w:sz w:val="24"/>
+                <w:szCs w:val="24"/>
+              </w:rPr>
               <w:t xml:space="preserve">O público alvo são os membros </w:t>
             </w:r>
             <w:r>
+              <w:rPr>
+                <w:rFonts w:ascii="Arial" w:hAnsi="Arial" w:cs="Arial"/>
+                <w:sz w:val="24"/>
+                <w:szCs w:val="24"/>
+              </w:rPr>
               <w:t>do projeto, desde de gestores até alunos.</w:t>
             </w:r>
           </w:p>
@@ -1417,11 +1454,19 @@
           <w:p>
             <w:pPr>
               <w:rPr>
+                <w:rFonts w:ascii="Arial" w:hAnsi="Arial" w:cs="Arial"/>
                 <w:color w:val="1F4E79"/>
-              </w:rPr>
-            </w:pPr>
-            <w:r>
-              <w:t xml:space="preserve">Após conversar com os gestores do projeto, foi observado problemas na parte de acompanhamento dos gestores com os alunos, para que o progresso de arrecadação fique mais fácil e visível para eles. Os alunos não têm acesso a uma área de cadastramento das doações para que gere um banco de dados acumulando e mostrando quanto é acumulado. </w:t>
+                <w:sz w:val="24"/>
+                <w:szCs w:val="24"/>
+              </w:rPr>
+            </w:pPr>
+            <w:r>
+              <w:rPr>
+                <w:rFonts w:ascii="Arial" w:hAnsi="Arial" w:cs="Arial"/>
+                <w:sz w:val="24"/>
+                <w:szCs w:val="24"/>
+              </w:rPr>
+              <w:t>Após conversar com os gestores do projeto, foram observados problemas no acompanhamento dos gestores com os alunos, dificultando a visualização do progresso da arrecadação. Os alunos não têm acesso a uma área de cadastramento das doações, o que impediria a criação de um banco de dados para acumular e exibir o total arrecadado.</w:t>
             </w:r>
           </w:p>
         </w:tc>
@@ -1482,11 +1527,19 @@
           <w:p>
             <w:pPr>
               <w:rPr>
+                <w:rFonts w:ascii="Arial" w:hAnsi="Arial" w:cs="Arial"/>
                 <w:color w:val="FF3333"/>
-              </w:rPr>
-            </w:pPr>
-            <w:r>
-              <w:t>Após estudar os problemas, entendemos que nosso sistema cubra as dificuldades do projeto, já que apresentamos áreas de cadastramento de doações que são transformadas em gráficos para os gestores, além de ter acesso as comprovações de doações (como nota fiscal) para que seja comprovado a arrecadação, além de temos uma área de comunicação direta do gestor para equipes.</w:t>
+                <w:sz w:val="24"/>
+                <w:szCs w:val="24"/>
+              </w:rPr>
+            </w:pPr>
+            <w:r>
+              <w:rPr>
+                <w:rFonts w:ascii="Arial" w:hAnsi="Arial" w:cs="Arial"/>
+                <w:sz w:val="24"/>
+                <w:szCs w:val="24"/>
+              </w:rPr>
+              <w:t>Após analisar os problemas, entendemos que nosso sistema atende às dificuldades do projeto, pois conta com áreas de cadastramento de doações que são transformadas em gráficos para os gestores. Além disso, há acesso às comprovações das doações (como notas fiscais), permitindo verificar a arrecadação. O sistema também dispõe de uma área de comunicação direta entre o gestor e as equipes.</w:t>
             </w:r>
           </w:p>
         </w:tc>
@@ -1596,6 +1649,72 @@
         <w:spacing w:after="0" w:line="240" w:lineRule="auto"/>
         <w:rPr>
           <w:rFonts w:ascii="Arial" w:eastAsia="Arial" w:hAnsi="Arial" w:cs="Arial"/>
+          <w:b/>
+          <w:sz w:val="20"/>
+          <w:szCs w:val="20"/>
+        </w:rPr>
+      </w:pPr>
+    </w:p>
+    <w:p>
+      <w:pPr>
+        <w:spacing w:after="0" w:line="240" w:lineRule="auto"/>
+        <w:rPr>
+          <w:rFonts w:ascii="Arial" w:eastAsia="Arial" w:hAnsi="Arial" w:cs="Arial"/>
+          <w:b/>
+          <w:sz w:val="20"/>
+          <w:szCs w:val="20"/>
+        </w:rPr>
+      </w:pPr>
+    </w:p>
+    <w:p>
+      <w:pPr>
+        <w:spacing w:after="0" w:line="240" w:lineRule="auto"/>
+        <w:rPr>
+          <w:rFonts w:ascii="Arial" w:eastAsia="Arial" w:hAnsi="Arial" w:cs="Arial"/>
+          <w:b/>
+          <w:sz w:val="20"/>
+          <w:szCs w:val="20"/>
+        </w:rPr>
+      </w:pPr>
+    </w:p>
+    <w:p>
+      <w:pPr>
+        <w:spacing w:after="0" w:line="240" w:lineRule="auto"/>
+        <w:rPr>
+          <w:rFonts w:ascii="Arial" w:eastAsia="Arial" w:hAnsi="Arial" w:cs="Arial"/>
+          <w:b/>
+          <w:sz w:val="20"/>
+          <w:szCs w:val="20"/>
+        </w:rPr>
+      </w:pPr>
+    </w:p>
+    <w:p>
+      <w:pPr>
+        <w:spacing w:after="0" w:line="240" w:lineRule="auto"/>
+        <w:rPr>
+          <w:rFonts w:ascii="Arial" w:eastAsia="Arial" w:hAnsi="Arial" w:cs="Arial"/>
+          <w:b/>
+          <w:sz w:val="20"/>
+          <w:szCs w:val="20"/>
+        </w:rPr>
+      </w:pPr>
+    </w:p>
+    <w:p>
+      <w:pPr>
+        <w:spacing w:after="0" w:line="240" w:lineRule="auto"/>
+        <w:rPr>
+          <w:rFonts w:ascii="Arial" w:eastAsia="Arial" w:hAnsi="Arial" w:cs="Arial"/>
+          <w:b/>
+          <w:sz w:val="20"/>
+          <w:szCs w:val="20"/>
+        </w:rPr>
+      </w:pPr>
+    </w:p>
+    <w:p>
+      <w:pPr>
+        <w:spacing w:after="0" w:line="240" w:lineRule="auto"/>
+        <w:rPr>
+          <w:rFonts w:ascii="Arial" w:eastAsia="Arial" w:hAnsi="Arial" w:cs="Arial"/>
           <w:sz w:val="20"/>
           <w:szCs w:val="20"/>
         </w:rPr>
@@ -1607,6 +1726,7 @@
           <w:sz w:val="20"/>
           <w:szCs w:val="20"/>
         </w:rPr>
+        <w:lastRenderedPageBreak/>
         <w:t>3 DESCRIÇÃO DO PROJETO</w:t>
       </w:r>
     </w:p>
@@ -1664,20 +1784,73 @@
           <w:p>
             <w:pPr>
               <w:rPr>
+                <w:rFonts w:ascii="Arial" w:hAnsi="Arial" w:cs="Arial"/>
                 <w:color w:val="000000"/>
-              </w:rPr>
-            </w:pPr>
-            <w:r>
-              <w:t xml:space="preserve">O projeto se baseia em um site informativo, com informações do dashboard e sobre </w:t>
-            </w:r>
-            <w:r>
-              <w:t>o projeto lideranças empáticas</w:t>
-            </w:r>
-            <w:r>
-              <w:t>, o dashboard é um sistema de administração e acompanhamento, os gestores tem acesso as áreas de finanças, administração</w:t>
-            </w:r>
-            <w:r>
-              <w:t>, visualização de dados e comunicação direta com as equipes. Já as equipes acesso para cadastrar as doações e visualizar as comunicações. Além de acesso para campanhas etc.</w:t>
+                <w:sz w:val="24"/>
+                <w:szCs w:val="24"/>
+              </w:rPr>
+            </w:pPr>
+            <w:r>
+              <w:rPr>
+                <w:rFonts w:ascii="Arial" w:hAnsi="Arial" w:cs="Arial"/>
+                <w:sz w:val="24"/>
+                <w:szCs w:val="24"/>
+              </w:rPr>
+              <w:t xml:space="preserve">O projeto baseia-se em um site informativo, que apresenta dados do </w:t>
+            </w:r>
+            <w:r>
+              <w:rPr>
+                <w:rStyle w:val="Forte"/>
+                <w:rFonts w:ascii="Arial" w:hAnsi="Arial" w:cs="Arial"/>
+                <w:b w:val="0"/>
+                <w:sz w:val="24"/>
+                <w:szCs w:val="24"/>
+              </w:rPr>
+              <w:t>dashboard</w:t>
+            </w:r>
+            <w:r>
+              <w:rPr>
+                <w:rFonts w:ascii="Arial" w:hAnsi="Arial" w:cs="Arial"/>
+                <w:sz w:val="24"/>
+                <w:szCs w:val="24"/>
+              </w:rPr>
+              <w:t xml:space="preserve"> e informações sobre o projeto </w:t>
+            </w:r>
+            <w:r>
+              <w:rPr>
+                <w:rStyle w:val="Forte"/>
+                <w:rFonts w:ascii="Arial" w:hAnsi="Arial" w:cs="Arial"/>
+                <w:b w:val="0"/>
+                <w:sz w:val="24"/>
+                <w:szCs w:val="24"/>
+              </w:rPr>
+              <w:t>Lideranças Empáticas</w:t>
+            </w:r>
+            <w:r>
+              <w:rPr>
+                <w:rFonts w:ascii="Arial" w:hAnsi="Arial" w:cs="Arial"/>
+                <w:sz w:val="24"/>
+                <w:szCs w:val="24"/>
+              </w:rPr>
+              <w:t xml:space="preserve">. O </w:t>
+            </w:r>
+            <w:r>
+              <w:rPr>
+                <w:rStyle w:val="Forte"/>
+                <w:rFonts w:ascii="Arial" w:hAnsi="Arial" w:cs="Arial"/>
+                <w:b w:val="0"/>
+                <w:sz w:val="24"/>
+                <w:szCs w:val="24"/>
+              </w:rPr>
+              <w:t>dashboard</w:t>
+            </w:r>
+            <w:r>
+              <w:rPr>
+                <w:rFonts w:ascii="Arial" w:hAnsi="Arial" w:cs="Arial"/>
+                <w:sz w:val="24"/>
+                <w:szCs w:val="24"/>
+              </w:rPr>
+              <w:t xml:space="preserve"> funciona como um sistema de administração e acompanhamento, no qual os gestores têm acesso às áreas de finanças, administração, visualização de dados e comunicação direta com as equipes. Já as equipes têm acesso para cadastrar doações, visualizar as comunicações e gerenciar campanhas, entre outras funcionalidades.</w:t>
             </w:r>
           </w:p>
         </w:tc>
@@ -1737,38 +1910,41 @@
             <w:shd w:val="clear" w:color="auto" w:fill="auto"/>
           </w:tcPr>
           <w:p>
-            <w:r>
-              <w:t xml:space="preserve">A crescente complexidade dos desafios sociais, notadamente a insegurança alimentar e a desigualdade, exige que as organizações do terceiro setor otimizem seus processos para maximizar o impacto de suas ações. Nesse contexto, a tecnologia emerge como uma ferramenta estratégica </w:t>
-            </w:r>
-            <w:r>
-              <w:lastRenderedPageBreak/>
-              <w:t>fundamental, capaz de aprimorar a gestão, a transparência e a eficiência de iniciativas de beneficência</w:t>
-            </w:r>
-            <w:proofErr w:type="gramStart"/>
-            <w:r>
-              <w:t>.</w:t>
-            </w:r>
-            <w:r>
-              <w:t xml:space="preserve"> </w:t>
-            </w:r>
-            <w:proofErr w:type="gramEnd"/>
-            <w:r>
-              <w:t>O projeto</w:t>
-            </w:r>
-            <w:r>
-              <w:t>, constitui uma intervenção direta nesse cenário. O objeto da intervenção é um dashboard de gestão desenvolvido para uma instituição que arrecada e distribui alimentos e recursos para pessoas em situação de vulnerabilidade. A relevância da plataforma reside em sua capacidade de centralizar dados, automatizar o monitoramento de doações, gerir estoques em tempo real e engajar voluntários, transformando a boa vontade em resultados mensuráveis e eficientes.</w:t>
-            </w:r>
-          </w:p>
-          <w:p>
             <w:pPr>
               <w:spacing w:after="0" w:line="240" w:lineRule="auto"/>
               <w:jc w:val="both"/>
               <w:rPr>
                 <w:rFonts w:ascii="Arial" w:eastAsia="Arial" w:hAnsi="Arial" w:cs="Arial"/>
-                <w:sz w:val="20"/>
-                <w:szCs w:val="20"/>
-              </w:rPr>
-            </w:pPr>
+                <w:sz w:val="24"/>
+                <w:szCs w:val="24"/>
+              </w:rPr>
+            </w:pPr>
+            <w:r>
+              <w:rPr>
+                <w:rFonts w:ascii="Arial" w:hAnsi="Arial" w:cs="Arial"/>
+                <w:sz w:val="24"/>
+                <w:szCs w:val="24"/>
+              </w:rPr>
+              <w:t xml:space="preserve">A crescente complexidade dos desafios sociais, notadamente a insegurança alimentar e a desigualdade, exige que as organizações do terceiro setor otimizem seus processos para maximizar o impacto de suas ações. Nesse contexto, a tecnologia emerge como uma ferramenta estratégica fundamental, capaz de aprimorar a gestão, a transparência e a eficiência das iniciativas de beneficência. O projeto constitui uma intervenção direta nesse cenário. O objeto dessa intervenção é um </w:t>
+            </w:r>
+            <w:r>
+              <w:rPr>
+                <w:rStyle w:val="Forte"/>
+                <w:rFonts w:ascii="Arial" w:hAnsi="Arial" w:cs="Arial"/>
+                <w:b w:val="0"/>
+                <w:sz w:val="24"/>
+                <w:szCs w:val="24"/>
+              </w:rPr>
+              <w:t>dashboard</w:t>
+            </w:r>
+            <w:r>
+              <w:rPr>
+                <w:rFonts w:ascii="Arial" w:hAnsi="Arial" w:cs="Arial"/>
+                <w:sz w:val="24"/>
+                <w:szCs w:val="24"/>
+              </w:rPr>
+              <w:t xml:space="preserve"> de gestão desenvolvido para uma instituição que arrecada e distribui alimentos e recursos a pessoas em situação de vulnerabilidade. A relevância da plataforma reside em sua capacidade de centralizar dados, automatizar o monitoramento de doações, gerir estoques em tempo real e engajar voluntários, transformando a boa vontade em resultados mensuráveis e eficientes.</w:t>
+            </w:r>
           </w:p>
         </w:tc>
       </w:tr>
@@ -1798,7 +1974,6 @@
     <w:p>
       <w:pPr>
         <w:spacing w:after="0" w:line="240" w:lineRule="auto"/>
-        <w:ind w:firstLine="708"/>
         <w:rPr>
           <w:rFonts w:ascii="Arial" w:eastAsia="Arial" w:hAnsi="Arial" w:cs="Arial"/>
           <w:b/>
@@ -1840,12 +2015,19 @@
           <w:p>
             <w:pPr>
               <w:rPr>
+                <w:rFonts w:ascii="Arial" w:hAnsi="Arial" w:cs="Arial"/>
                 <w:color w:val="FF3333"/>
-                <w:sz w:val="20"/>
-              </w:rPr>
-            </w:pPr>
-            <w:r>
-              <w:t>Propomos o desenvolvimento de uma plataforma web para centralizar a gestão de doações, equipes e beneficiários. A ferramenta otimizará o controle de estoque de alimentos em tempo real para evitar desperdícios e apoiará a tomada de decisões estratégicas por meio de relatórios claros. O objetivo é fornecer uma solução tecnológica funcional e de baixo custo que promova o engajamento e a transparência para as operações diárias da organização.</w:t>
+                <w:sz w:val="24"/>
+                <w:szCs w:val="24"/>
+              </w:rPr>
+            </w:pPr>
+            <w:r>
+              <w:rPr>
+                <w:rFonts w:ascii="Arial" w:hAnsi="Arial" w:cs="Arial"/>
+                <w:sz w:val="24"/>
+                <w:szCs w:val="24"/>
+              </w:rPr>
+              <w:t>Propomos o desenvolvimento de uma plataforma web destinada a centralizar a gestão de doações, equipes e beneficiários. A ferramenta otimizará o controle de estoque de alimentos em tempo real, evitando desperdícios e apoiando a tomada de decisões estratégicas por meio de relatórios claros e objetivos. O principal propósito é fornecer uma solução tecnológica funcional e de baixo custo, que promova o engajamento e a transparência nas operações diárias da organização.</w:t>
             </w:r>
           </w:p>
         </w:tc>
@@ -1932,25 +2114,51 @@
             <w:shd w:val="clear" w:color="auto" w:fill="auto"/>
           </w:tcPr>
           <w:p>
-            <w:r>
+            <w:pPr>
+              <w:rPr>
+                <w:rFonts w:ascii="Arial" w:hAnsi="Arial" w:cs="Arial"/>
+                <w:sz w:val="24"/>
+                <w:szCs w:val="24"/>
+              </w:rPr>
+            </w:pPr>
+            <w:r>
+              <w:rPr>
+                <w:rFonts w:ascii="Arial" w:hAnsi="Arial" w:cs="Arial"/>
+                <w:sz w:val="24"/>
+                <w:szCs w:val="24"/>
+              </w:rPr>
               <w:t>Este projeto consiste na criação de uma plataforma digital para ajudar uma instituição de caridade parceira. Começamos conversando com os gestores e voluntários para entender suas principais dificuldades no dia a dia, como o controle de doações e do estoque.</w:t>
             </w:r>
             <w:r>
+              <w:rPr>
+                <w:rFonts w:ascii="Arial" w:hAnsi="Arial" w:cs="Arial"/>
+                <w:sz w:val="24"/>
+                <w:szCs w:val="24"/>
+              </w:rPr>
               <w:t xml:space="preserve"> </w:t>
             </w:r>
             <w:r>
-              <w:t xml:space="preserve">Com base nessas necessidades, desenvolvemos </w:t>
-            </w:r>
-            <w:r>
-              <w:t>a ferramenta</w:t>
-            </w:r>
-            <w:r>
-              <w:t>, com uma interface simples e painéis de controle diferentes para administradores e para a equipe.</w:t>
-            </w:r>
-            <w:r>
+              <w:rPr>
+                <w:rFonts w:ascii="Arial" w:hAnsi="Arial" w:cs="Arial"/>
+                <w:sz w:val="24"/>
+                <w:szCs w:val="24"/>
+              </w:rPr>
+              <w:t>Com base nessas necessidades, desenvolvemos a ferramenta, com uma interface simples e painéis de controle diferentes para administradores e para a equipe.</w:t>
+            </w:r>
+            <w:r>
+              <w:rPr>
+                <w:rFonts w:ascii="Arial" w:hAnsi="Arial" w:cs="Arial"/>
+                <w:sz w:val="24"/>
+                <w:szCs w:val="24"/>
+              </w:rPr>
               <w:t xml:space="preserve"> </w:t>
             </w:r>
             <w:r>
+              <w:rPr>
+                <w:rFonts w:ascii="Arial" w:hAnsi="Arial" w:cs="Arial"/>
+                <w:sz w:val="24"/>
+                <w:szCs w:val="24"/>
+              </w:rPr>
               <w:t>Ao final, entregamos a plataforma pronta para uso. O sucesso do projeto será medido pelo feedback dos próprios usuários, que nos ajudará a validar a solução e a planejar melhorias futuras.</w:t>
             </w:r>
           </w:p>
@@ -2020,16 +2228,43 @@
             <w:shd w:val="clear" w:color="auto" w:fill="auto"/>
           </w:tcPr>
           <w:p>
-            <w:r>
+            <w:pPr>
+              <w:rPr>
+                <w:rFonts w:ascii="Arial" w:hAnsi="Arial" w:cs="Arial"/>
+                <w:sz w:val="24"/>
+                <w:szCs w:val="24"/>
+              </w:rPr>
+            </w:pPr>
+            <w:r>
+              <w:rPr>
+                <w:rFonts w:ascii="Arial" w:hAnsi="Arial" w:cs="Arial"/>
+                <w:sz w:val="24"/>
+                <w:szCs w:val="24"/>
+              </w:rPr>
               <w:t>Esperamos que o dashboard potencialize o processo de administração</w:t>
             </w:r>
             <w:r>
+              <w:rPr>
+                <w:rFonts w:ascii="Arial" w:hAnsi="Arial" w:cs="Arial"/>
+                <w:sz w:val="24"/>
+                <w:szCs w:val="24"/>
+              </w:rPr>
               <w:t xml:space="preserve"> como um todo</w:t>
             </w:r>
             <w:r>
+              <w:rPr>
+                <w:rFonts w:ascii="Arial" w:hAnsi="Arial" w:cs="Arial"/>
+                <w:sz w:val="24"/>
+                <w:szCs w:val="24"/>
+              </w:rPr>
               <w:t xml:space="preserve"> </w:t>
             </w:r>
             <w:r>
+              <w:rPr>
+                <w:rFonts w:ascii="Arial" w:hAnsi="Arial" w:cs="Arial"/>
+                <w:sz w:val="24"/>
+                <w:szCs w:val="24"/>
+              </w:rPr>
               <w:t>dos gestores, além que os alunos com facilidade e praticidade possa registrar as doações, mas com o principal ideal de ajudar a causa do projeto Lideranças Empáticas, potencializar a arrecadação de alimento para que mais famílias possam ser beneficiadas.</w:t>
             </w:r>
           </w:p>
@@ -2090,29 +2325,60 @@
           <w:p>
             <w:pPr>
               <w:rPr>
+                <w:rFonts w:ascii="Arial" w:hAnsi="Arial" w:cs="Arial"/>
                 <w:color w:val="FF3333"/>
-              </w:rPr>
-            </w:pPr>
-            <w:r>
+                <w:sz w:val="24"/>
+                <w:szCs w:val="24"/>
+              </w:rPr>
+            </w:pPr>
+            <w:r>
+              <w:rPr>
+                <w:rFonts w:ascii="Arial" w:hAnsi="Arial" w:cs="Arial"/>
+                <w:sz w:val="24"/>
+                <w:szCs w:val="24"/>
+              </w:rPr>
               <w:t xml:space="preserve">Agradecemos primeiramente a </w:t>
             </w:r>
             <w:proofErr w:type="spellStart"/>
             <w:r>
+              <w:rPr>
+                <w:rFonts w:ascii="Arial" w:hAnsi="Arial" w:cs="Arial"/>
+                <w:sz w:val="24"/>
+                <w:szCs w:val="24"/>
+              </w:rPr>
               <w:t>Fecap</w:t>
             </w:r>
             <w:proofErr w:type="spellEnd"/>
             <w:r>
+              <w:rPr>
+                <w:rFonts w:ascii="Arial" w:hAnsi="Arial" w:cs="Arial"/>
+                <w:sz w:val="24"/>
+                <w:szCs w:val="24"/>
+              </w:rPr>
               <w:t xml:space="preserve"> por todo o suporte, aos professores pelos conselhos e acompanhamento constante</w:t>
             </w:r>
             <w:r>
+              <w:rPr>
+                <w:rFonts w:ascii="Arial" w:hAnsi="Arial" w:cs="Arial"/>
+                <w:sz w:val="24"/>
+                <w:szCs w:val="24"/>
+              </w:rPr>
               <w:t xml:space="preserve">, nos ajudando a construir o projeto, e ao Lideranças Empáticas, pela oportunidade de ajudar um projeto lindo e inspirador, ficamos felizes com a oportunidade de poder ajudar e esperamos que o nosso projeto atenda as expectativas. </w:t>
             </w:r>
-            <w:bookmarkStart w:id="0" w:name="_GoBack"/>
-            <w:bookmarkEnd w:id="0"/>
           </w:p>
         </w:tc>
       </w:tr>
     </w:tbl>
+    <w:p>
+      <w:pPr>
+        <w:spacing w:after="0" w:line="240" w:lineRule="auto"/>
+        <w:rPr>
+          <w:rFonts w:ascii="Arial" w:eastAsia="Arial" w:hAnsi="Arial" w:cs="Arial"/>
+          <w:sz w:val="20"/>
+          <w:szCs w:val="20"/>
+        </w:rPr>
+      </w:pPr>
+    </w:p>
     <w:p>
       <w:pPr>
         <w:spacing w:after="0" w:line="240" w:lineRule="auto"/>
@@ -2181,7 +2447,6 @@
                 <w:sz w:val="20"/>
                 <w:szCs w:val="20"/>
               </w:rPr>
-              <w:lastRenderedPageBreak/>
               <w:t>Inserir os dados neste espaço. Orientações: Adotar a versão atual da ABNT.</w:t>
             </w:r>
           </w:p>
@@ -2231,6 +2496,8 @@
           <w:szCs w:val="20"/>
         </w:rPr>
       </w:pPr>
+      <w:bookmarkStart w:id="0" w:name="_GoBack"/>
+      <w:bookmarkEnd w:id="0"/>
     </w:p>
     <w:p>
       <w:pPr>
@@ -2316,19 +2583,19 @@
               <w:rPr>
                 <w:rFonts w:ascii="Arial" w:eastAsia="Arial" w:hAnsi="Arial" w:cs="Arial"/>
                 <w:b/>
-                <w:sz w:val="20"/>
-                <w:szCs w:val="20"/>
+                <w:color w:val="000000" w:themeColor="text1"/>
+                <w:sz w:val="24"/>
+                <w:szCs w:val="24"/>
               </w:rPr>
             </w:pPr>
             <w:r>
               <w:rPr>
                 <w:rFonts w:ascii="Arial" w:eastAsia="Arial" w:hAnsi="Arial" w:cs="Arial"/>
-                <w:color w:val="525252" w:themeColor="accent3" w:themeShade="80"/>
-                <w:sz w:val="20"/>
-                <w:szCs w:val="20"/>
-                <w:highlight w:val="white"/>
-              </w:rPr>
-              <w:t>As atividades de extensão podem resultar em produto caracterizado a partir do fazer extensionista, sempre mediados pela interação dialógica entre a comunidade acadêmica e a sociedade e seus setores, sendo exemplos: softwares; aplicativos; protótipos; desenhos técnicos; patentes; simuladores; objetos de aprendizagem; games; insumos alternativos; processos e procedimentos operativos inovadores; relatórios; relatos de experiências; cartilhas; revistas; manuais; jornais; informativos; livros; anais; cartazes; artigos; resumos; pôster; banner; site; portal; hotsite; fotografia; vídeos; áudios; tutoriais, dentre outros.</w:t>
+                <w:color w:val="000000" w:themeColor="text1"/>
+                <w:sz w:val="24"/>
+                <w:szCs w:val="24"/>
+              </w:rPr>
+              <w:t>https://github.com/2025-2-NCC2/Projeto4.git</w:t>
             </w:r>
           </w:p>
         </w:tc>
@@ -3359,6 +3626,17 @@
       <w:szCs w:val="20"/>
     </w:rPr>
   </w:style>
+  <w:style w:type="character" w:styleId="Forte">
+    <w:name w:val="Strong"/>
+    <w:basedOn w:val="Fontepargpadro"/>
+    <w:uiPriority w:val="22"/>
+    <w:qFormat/>
+    <w:rsid w:val="007B20E5"/>
+    <w:rPr>
+      <w:b/>
+      <w:bCs/>
+    </w:rPr>
+  </w:style>
 </w:styles>
 </file>
 
@@ -3658,26 +3936,6 @@
 </file>
 
 <file path=customXml/item1.xml><?xml version="1.0" encoding="utf-8"?>
-<?mso-contentType ?>
-<FormTemplates xmlns="http://schemas.microsoft.com/sharepoint/v3/contenttype/forms">
-  <Display>DocumentLibraryForm</Display>
-  <Edit>DocumentLibraryForm</Edit>
-  <New>DocumentLibraryForm</New>
-</FormTemplates>
-</file>
-
-<file path=customXml/item2.xml><?xml version="1.0" encoding="utf-8"?>
-<p:properties xmlns:p="http://schemas.microsoft.com/office/2006/metadata/properties" xmlns:xsi="http://www.w3.org/2001/XMLSchema-instance" xmlns:pc="http://schemas.microsoft.com/office/infopath/2007/PartnerControls">
-  <documentManagement>
-    <lcf76f155ced4ddcb4097134ff3c332f xmlns="8ca2a57e-8138-4b57-956a-eb6e2c7049cc">
-      <Terms xmlns="http://schemas.microsoft.com/office/infopath/2007/PartnerControls"/>
-    </lcf76f155ced4ddcb4097134ff3c332f>
-    <TaxCatchAll xmlns="1d2798d9-1030-4cc5-be7b-200f9e628651" xsi:nil="true"/>
-  </documentManagement>
-</p:properties>
-</file>
-
-<file path=customXml/item3.xml><?xml version="1.0" encoding="utf-8"?>
 <ct:contentTypeSchema xmlns:ct="http://schemas.microsoft.com/office/2006/metadata/contentType" xmlns:ma="http://schemas.microsoft.com/office/2006/metadata/properties/metaAttributes" ct:_="" ma:_="" ma:contentTypeName="Documento" ma:contentTypeID="0x01010045364877AF745B4281652B53F43C594A" ma:contentTypeVersion="15" ma:contentTypeDescription="Crie um novo documento." ma:contentTypeScope="" ma:versionID="440a6fbbcbce65e3f8e2bed610644788">
   <xsd:schema xmlns:xsd="http://www.w3.org/2001/XMLSchema" xmlns:xs="http://www.w3.org/2001/XMLSchema" xmlns:p="http://schemas.microsoft.com/office/2006/metadata/properties" xmlns:ns2="1d2798d9-1030-4cc5-be7b-200f9e628651" xmlns:ns3="8ca2a57e-8138-4b57-956a-eb6e2c7049cc" targetNamespace="http://schemas.microsoft.com/office/2006/metadata/properties" ma:root="true" ma:fieldsID="3ff20d9b6411658b7762fa2c08d7e1af" ns2:_="" ns3:_="">
     <xsd:import namespace="1d2798d9-1030-4cc5-be7b-200f9e628651"/>
@@ -3912,10 +4170,41 @@
 </ct:contentTypeSchema>
 </file>
 
+<file path=customXml/item2.xml><?xml version="1.0" encoding="utf-8"?>
+<p:properties xmlns:p="http://schemas.microsoft.com/office/2006/metadata/properties" xmlns:xsi="http://www.w3.org/2001/XMLSchema-instance" xmlns:pc="http://schemas.microsoft.com/office/infopath/2007/PartnerControls">
+  <documentManagement>
+    <lcf76f155ced4ddcb4097134ff3c332f xmlns="8ca2a57e-8138-4b57-956a-eb6e2c7049cc">
+      <Terms xmlns="http://schemas.microsoft.com/office/infopath/2007/PartnerControls"/>
+    </lcf76f155ced4ddcb4097134ff3c332f>
+    <TaxCatchAll xmlns="1d2798d9-1030-4cc5-be7b-200f9e628651" xsi:nil="true"/>
+  </documentManagement>
+</p:properties>
+</file>
+
+<file path=customXml/item3.xml><?xml version="1.0" encoding="utf-8"?>
+<?mso-contentType ?>
+<FormTemplates xmlns="http://schemas.microsoft.com/sharepoint/v3/contenttype/forms">
+  <Display>DocumentLibraryForm</Display>
+  <Edit>DocumentLibraryForm</Edit>
+  <New>DocumentLibraryForm</New>
+</FormTemplates>
+</file>
+
 <file path=customXml/itemProps1.xml><?xml version="1.0" encoding="utf-8"?>
-<ds:datastoreItem xmlns:ds="http://schemas.openxmlformats.org/officeDocument/2006/customXml" ds:itemID="{6C7D064E-B9B1-4DD1-96C1-B59BEDBDE508}">
+<ds:datastoreItem xmlns:ds="http://schemas.openxmlformats.org/officeDocument/2006/customXml" ds:itemID="{5C49EB71-DCC6-4AD6-B283-AD28F75E5568}">
   <ds:schemaRefs>
-    <ds:schemaRef ds:uri="http://schemas.microsoft.com/sharepoint/v3/contenttype/forms"/>
+    <ds:schemaRef ds:uri="http://schemas.microsoft.com/office/2006/metadata/contentType"/>
+    <ds:schemaRef ds:uri="http://schemas.microsoft.com/office/2006/metadata/properties/metaAttributes"/>
+    <ds:schemaRef ds:uri="http://www.w3.org/2001/XMLSchema"/>
+    <ds:schemaRef ds:uri="http://schemas.microsoft.com/office/2006/metadata/properties"/>
+    <ds:schemaRef ds:uri="1d2798d9-1030-4cc5-be7b-200f9e628651"/>
+    <ds:schemaRef ds:uri="8ca2a57e-8138-4b57-956a-eb6e2c7049cc"/>
+    <ds:schemaRef ds:uri="http://schemas.microsoft.com/office/2006/documentManagement/types"/>
+    <ds:schemaRef ds:uri="http://schemas.microsoft.com/office/infopath/2007/PartnerControls"/>
+    <ds:schemaRef ds:uri="http://schemas.openxmlformats.org/package/2006/metadata/core-properties"/>
+    <ds:schemaRef ds:uri="http://purl.org/dc/elements/1.1/"/>
+    <ds:schemaRef ds:uri="http://purl.org/dc/terms/"/>
+    <ds:schemaRef ds:uri="http://schemas.microsoft.com/internal/obd"/>
   </ds:schemaRefs>
 </ds:datastoreItem>
 </file>
@@ -3932,20 +4221,9 @@
 </file>
 
 <file path=customXml/itemProps3.xml><?xml version="1.0" encoding="utf-8"?>
-<ds:datastoreItem xmlns:ds="http://schemas.openxmlformats.org/officeDocument/2006/customXml" ds:itemID="{5C49EB71-DCC6-4AD6-B283-AD28F75E5568}">
+<ds:datastoreItem xmlns:ds="http://schemas.openxmlformats.org/officeDocument/2006/customXml" ds:itemID="{6C7D064E-B9B1-4DD1-96C1-B59BEDBDE508}">
   <ds:schemaRefs>
-    <ds:schemaRef ds:uri="http://schemas.microsoft.com/office/2006/metadata/contentType"/>
-    <ds:schemaRef ds:uri="http://schemas.microsoft.com/office/2006/metadata/properties/metaAttributes"/>
-    <ds:schemaRef ds:uri="http://www.w3.org/2001/XMLSchema"/>
-    <ds:schemaRef ds:uri="http://schemas.microsoft.com/office/2006/metadata/properties"/>
-    <ds:schemaRef ds:uri="1d2798d9-1030-4cc5-be7b-200f9e628651"/>
-    <ds:schemaRef ds:uri="8ca2a57e-8138-4b57-956a-eb6e2c7049cc"/>
-    <ds:schemaRef ds:uri="http://schemas.microsoft.com/office/2006/documentManagement/types"/>
-    <ds:schemaRef ds:uri="http://schemas.microsoft.com/office/infopath/2007/PartnerControls"/>
-    <ds:schemaRef ds:uri="http://schemas.openxmlformats.org/package/2006/metadata/core-properties"/>
-    <ds:schemaRef ds:uri="http://purl.org/dc/elements/1.1/"/>
-    <ds:schemaRef ds:uri="http://purl.org/dc/terms/"/>
-    <ds:schemaRef ds:uri="http://schemas.microsoft.com/internal/obd"/>
+    <ds:schemaRef ds:uri="http://schemas.microsoft.com/sharepoint/v3/contenttype/forms"/>
   </ds:schemaRefs>
 </ds:datastoreItem>
 </file>
</xml_diff>